<commit_message>
Adding voice feature and updating matrix theme for UI
</commit_message>
<xml_diff>
--- a/ConfidenceOS/Interview_confidence_booster_features.docx
+++ b/ConfidenceOS/Interview_confidence_booster_features.docx
@@ -35,7 +35,7 @@
           <w:noProof/>
           <w:kern w:val="0"/>
         </w:rPr>
-        <w:pict w14:anchorId="6C613D67">
+        <w:pict w14:anchorId="20697FE2">
           <v:rect id="_x0000_i1029" alt="" style="width:468pt;height:.05pt;mso-width-percent:0;mso-height-percent:0;mso-width-percent:0;mso-height-percent:0" o:hralign="center" o:hrstd="t" o:hr="t" fillcolor="#a0a0a0" stroked="f"/>
         </w:pict>
       </w:r>
@@ -130,7 +130,7 @@
           <w:noProof/>
           <w:kern w:val="0"/>
         </w:rPr>
-        <w:pict w14:anchorId="6B67B626">
+        <w:pict w14:anchorId="12CB7E73">
           <v:rect id="_x0000_i1028" alt="" style="width:468pt;height:.05pt;mso-width-percent:0;mso-height-percent:0;mso-width-percent:0;mso-height-percent:0" o:hralign="center" o:hrstd="t" o:hr="t" fillcolor="#a0a0a0" stroked="f"/>
         </w:pict>
       </w:r>
@@ -413,7 +413,7 @@
           <w:noProof/>
           <w:kern w:val="0"/>
         </w:rPr>
-        <w:pict w14:anchorId="76B5C803">
+        <w:pict w14:anchorId="1AB18960">
           <v:rect id="_x0000_i1027" alt="" style="width:468pt;height:.05pt;mso-width-percent:0;mso-height-percent:0;mso-width-percent:0;mso-height-percent:0" o:hralign="center" o:hrstd="t" o:hr="t" fillcolor="#a0a0a0" stroked="f"/>
         </w:pict>
       </w:r>
@@ -763,7 +763,7 @@
           <w:noProof/>
           <w:kern w:val="0"/>
         </w:rPr>
-        <w:pict w14:anchorId="429D1F43">
+        <w:pict w14:anchorId="0CDDAEC3">
           <v:rect id="_x0000_i1026" alt="" style="width:468pt;height:.05pt;mso-width-percent:0;mso-height-percent:0;mso-width-percent:0;mso-height-percent:0" o:hralign="center" o:hrstd="t" o:hr="t" fillcolor="#a0a0a0" stroked="f"/>
         </w:pict>
       </w:r>
@@ -968,7 +968,7 @@
           <w:noProof/>
           <w:kern w:val="0"/>
         </w:rPr>
-        <w:pict w14:anchorId="09CD8D05">
+        <w:pict w14:anchorId="7040BFC2">
           <v:rect id="_x0000_i1025" alt="" style="width:468pt;height:.05pt;mso-width-percent:0;mso-height-percent:0;mso-width-percent:0;mso-height-percent:0" o:hralign="center" o:hrstd="t" o:hr="t" fillcolor="#a0a0a0" stroked="f"/>
         </w:pict>
       </w:r>
@@ -1185,6 +1185,45 @@
       </w:r>
     </w:p>
     <w:p/>
+    <w:p>
+      <w:r>
+        <w:drawing>
+          <wp:inline distT="0" distB="0" distL="0" distR="0" wp14:anchorId="02EC4A9D" wp14:editId="184E45A9">
+            <wp:extent cx="5943600" cy="5415280"/>
+            <wp:effectExtent l="0" t="0" r="0" b="0"/>
+            <wp:docPr id="469724358" name="Picture 1" descr="A screenshot of a computer&#10;&#10;AI-generated content may be incorrect."/>
+            <wp:cNvGraphicFramePr>
+              <a:graphicFrameLocks xmlns:a="http://schemas.openxmlformats.org/drawingml/2006/main" noChangeAspect="1"/>
+            </wp:cNvGraphicFramePr>
+            <a:graphic xmlns:a="http://schemas.openxmlformats.org/drawingml/2006/main">
+              <a:graphicData uri="http://schemas.openxmlformats.org/drawingml/2006/picture">
+                <pic:pic xmlns:pic="http://schemas.openxmlformats.org/drawingml/2006/picture">
+                  <pic:nvPicPr>
+                    <pic:cNvPr id="469724358" name="Picture 1" descr="A screenshot of a computer&#10;&#10;AI-generated content may be incorrect."/>
+                    <pic:cNvPicPr/>
+                  </pic:nvPicPr>
+                  <pic:blipFill>
+                    <a:blip r:embed="rId5"/>
+                    <a:stretch>
+                      <a:fillRect/>
+                    </a:stretch>
+                  </pic:blipFill>
+                  <pic:spPr>
+                    <a:xfrm>
+                      <a:off x="0" y="0"/>
+                      <a:ext cx="5943600" cy="5415280"/>
+                    </a:xfrm>
+                    <a:prstGeom prst="rect">
+                      <a:avLst/>
+                    </a:prstGeom>
+                  </pic:spPr>
+                </pic:pic>
+              </a:graphicData>
+            </a:graphic>
+          </wp:inline>
+        </w:drawing>
+      </w:r>
+    </w:p>
     <w:sectPr>
       <w:pgSz w:w="12240" w:h="15840"/>
       <w:pgMar w:top="1440" w:right="1440" w:bottom="1440" w:left="1440" w:header="720" w:footer="720" w:gutter="0"/>

</xml_diff>